<commit_message>
Correccion informes, agregado de documento_testing
</commit_message>
<xml_diff>
--- a/Documentacion/Especificación de Requisitos de Software.docx
+++ b/Documentacion/Especificación de Requisitos de Software.docx
@@ -105,20 +105,8 @@
                 <w:sz w:val="44"/>
                 <w:szCs w:val="44"/>
               </w:rPr>
-              <w:t xml:space="preserve">Proyecto: Digitalización de </w:t>
+              <w:t>Proyecto: Digitalización de Cosarbo</w:t>
             </w:r>
-            <w:proofErr w:type="spellStart"/>
-            <w:r>
-              <w:rPr>
-                <w:rFonts w:ascii="Calibri" w:eastAsia="Calibri" w:hAnsi="Calibri" w:cs="Calibri"/>
-                <w:i/>
-                <w:iCs/>
-                <w:sz w:val="44"/>
-                <w:szCs w:val="44"/>
-              </w:rPr>
-              <w:t>Cosarbo</w:t>
-            </w:r>
-            <w:proofErr w:type="spellEnd"/>
           </w:p>
         </w:tc>
       </w:tr>
@@ -2183,21 +2171,7 @@
         <w:rPr>
           <w:rFonts w:ascii="Calibri" w:eastAsia="Calibri" w:hAnsi="Calibri" w:cs="Calibri"/>
         </w:rPr>
-        <w:t>(Versión preliminar, sustentada a cambios) El presente documento de Especificación de Requisitos del Software (o cómo sus siglas indican ERS) tiene como propósito definir las funcionalidades, el comportamiento y las características que tendrá el sistema “</w:t>
-      </w:r>
-      <w:proofErr w:type="spellStart"/>
-      <w:r>
-        <w:rPr>
-          <w:rFonts w:ascii="Calibri" w:eastAsia="Calibri" w:hAnsi="Calibri" w:cs="Calibri"/>
-        </w:rPr>
-        <w:t>Cosarbo</w:t>
-      </w:r>
-      <w:proofErr w:type="spellEnd"/>
-      <w:r>
-        <w:rPr>
-          <w:rFonts w:ascii="Calibri" w:eastAsia="Calibri" w:hAnsi="Calibri" w:cs="Calibri"/>
-        </w:rPr>
-        <w:t>”.</w:t>
+        <w:t>(Versión preliminar, sustentada a cambios) El presente documento de Especificación de Requisitos del Software (o cómo sus siglas indican ERS) tiene como propósito definir las funcionalidades, el comportamiento y las características que tendrá el sistema “Cosarbo”.</w:t>
       </w:r>
     </w:p>
     <w:p>
@@ -2321,35 +2295,7 @@
         <w:rPr>
           <w:rFonts w:ascii="Calibri" w:eastAsia="Calibri" w:hAnsi="Calibri" w:cs="Calibri"/>
         </w:rPr>
-        <w:t>El sistema llamado “</w:t>
-      </w:r>
-      <w:proofErr w:type="spellStart"/>
-      <w:r>
-        <w:rPr>
-          <w:rFonts w:ascii="Calibri" w:eastAsia="Calibri" w:hAnsi="Calibri" w:cs="Calibri"/>
-        </w:rPr>
-        <w:t>Cosarbo</w:t>
-      </w:r>
-      <w:proofErr w:type="spellEnd"/>
-      <w:r>
-        <w:rPr>
-          <w:rFonts w:ascii="Calibri" w:eastAsia="Calibri" w:hAnsi="Calibri" w:cs="Calibri"/>
-        </w:rPr>
-        <w:t xml:space="preserve">” será un sitio </w:t>
-      </w:r>
-      <w:proofErr w:type="gramStart"/>
-      <w:r>
-        <w:rPr>
-          <w:rFonts w:ascii="Calibri" w:eastAsia="Calibri" w:hAnsi="Calibri" w:cs="Calibri"/>
-        </w:rPr>
-        <w:t>web  que</w:t>
-      </w:r>
-      <w:proofErr w:type="gramEnd"/>
-      <w:r>
-        <w:rPr>
-          <w:rFonts w:ascii="Calibri" w:eastAsia="Calibri" w:hAnsi="Calibri" w:cs="Calibri"/>
-        </w:rPr>
-        <w:t xml:space="preserve"> venderá productos realizados con técnica de crochet y servicios de costurera, además de permitir a sus usuarios contactar con la tienda a través de e-mail.</w:t>
+        <w:t>El sistema llamado “Cosarbo” será un sitio web  que venderá productos realizados con técnica de crochet y servicios de costurera, además de permitir a sus usuarios contactar con la tienda a través de e-mail.</w:t>
       </w:r>
     </w:p>
     <w:p>
@@ -2449,37 +2395,6 @@
           <w:rFonts w:ascii="Calibri" w:eastAsia="Calibri" w:hAnsi="Calibri" w:cs="Calibri"/>
         </w:rPr>
         <w:t>Permitir a los administradores crear y modificar productos.</w:t>
-      </w:r>
-    </w:p>
-    <w:p>
-      <w:pPr>
-        <w:numPr>
-          <w:ilvl w:val="0"/>
-          <w:numId w:val="7"/>
-        </w:numPr>
-        <w:rPr>
-          <w:rFonts w:ascii="Calibri" w:eastAsia="Calibri" w:hAnsi="Calibri" w:cs="Calibri"/>
-        </w:rPr>
-      </w:pPr>
-      <w:r>
-        <w:rPr>
-          <w:rFonts w:ascii="Calibri" w:eastAsia="Calibri" w:hAnsi="Calibri" w:cs="Calibri"/>
-        </w:rPr>
-        <w:t xml:space="preserve">Permitir al administrador ver los </w:t>
-      </w:r>
-      <w:proofErr w:type="spellStart"/>
-      <w:r>
-        <w:rPr>
-          <w:rFonts w:ascii="Calibri" w:eastAsia="Calibri" w:hAnsi="Calibri" w:cs="Calibri"/>
-        </w:rPr>
-        <w:t>dashboard</w:t>
-      </w:r>
-      <w:proofErr w:type="spellEnd"/>
-      <w:r>
-        <w:rPr>
-          <w:rFonts w:ascii="Calibri" w:eastAsia="Calibri" w:hAnsi="Calibri" w:cs="Calibri"/>
-        </w:rPr>
-        <w:t xml:space="preserve"> con información de gestión.</w:t>
       </w:r>
     </w:p>
     <w:p>
@@ -2821,7 +2736,6 @@
         <w:rPr>
           <w:rFonts w:ascii="Calibri" w:eastAsia="Calibri" w:hAnsi="Calibri" w:cs="Calibri"/>
         </w:rPr>
-        <w:lastRenderedPageBreak/>
         <w:t>HI: Interfaz de Hardware.</w:t>
       </w:r>
     </w:p>
@@ -2839,6 +2753,7 @@
         <w:rPr>
           <w:rFonts w:ascii="Calibri" w:eastAsia="Calibri" w:hAnsi="Calibri" w:cs="Calibri"/>
         </w:rPr>
+        <w:lastRenderedPageBreak/>
         <w:t>SI: Interfaz de Software.</w:t>
       </w:r>
     </w:p>
@@ -3104,21 +3019,7 @@
         <w:rPr>
           <w:rFonts w:ascii="Calibri" w:eastAsia="Calibri" w:hAnsi="Calibri" w:cs="Calibri"/>
         </w:rPr>
-        <w:t xml:space="preserve">El sistema será un sitio web con una estructura y diseño visual basados en la estética de múltiples tiendas especializadas en costura y amigurumis, adaptado al catálogo de productos ofrecidos por la tienda </w:t>
-      </w:r>
-      <w:proofErr w:type="spellStart"/>
-      <w:r>
-        <w:rPr>
-          <w:rFonts w:ascii="Calibri" w:eastAsia="Calibri" w:hAnsi="Calibri" w:cs="Calibri"/>
-        </w:rPr>
-        <w:t>Cosarbo</w:t>
-      </w:r>
-      <w:proofErr w:type="spellEnd"/>
-      <w:r>
-        <w:rPr>
-          <w:rFonts w:ascii="Calibri" w:eastAsia="Calibri" w:hAnsi="Calibri" w:cs="Calibri"/>
-        </w:rPr>
-        <w:t>.</w:t>
+        <w:t>El sistema será un sitio web con una estructura y diseño visual basados en la estética de múltiples tiendas especializadas en costura y amigurumis, adaptado al catálogo de productos ofrecidos por la tienda Cosarbo.</w:t>
       </w:r>
     </w:p>
     <w:p>
@@ -3365,21 +3266,7 @@
         <w:rPr>
           <w:rFonts w:ascii="Calibri" w:eastAsia="Calibri" w:hAnsi="Calibri" w:cs="Calibri"/>
         </w:rPr>
-        <w:t xml:space="preserve">El sistema utilizará </w:t>
-      </w:r>
-      <w:proofErr w:type="spellStart"/>
-      <w:r>
-        <w:rPr>
-          <w:rFonts w:ascii="Calibri" w:eastAsia="Calibri" w:hAnsi="Calibri" w:cs="Calibri"/>
-        </w:rPr>
-        <w:t>React</w:t>
-      </w:r>
-      <w:proofErr w:type="spellEnd"/>
-      <w:r>
-        <w:rPr>
-          <w:rFonts w:ascii="Calibri" w:eastAsia="Calibri" w:hAnsi="Calibri" w:cs="Calibri"/>
-        </w:rPr>
-        <w:t xml:space="preserve"> con Vite para la interfaz de usuario.</w:t>
+        <w:t>El sistema utilizará React con Vite para la interfaz de usuario.</w:t>
       </w:r>
     </w:p>
     <w:p>
@@ -3396,21 +3283,7 @@
         <w:rPr>
           <w:rFonts w:ascii="Calibri" w:eastAsia="Calibri" w:hAnsi="Calibri" w:cs="Calibri"/>
         </w:rPr>
-        <w:t xml:space="preserve">El </w:t>
-      </w:r>
-      <w:proofErr w:type="spellStart"/>
-      <w:r>
-        <w:rPr>
-          <w:rFonts w:ascii="Calibri" w:eastAsia="Calibri" w:hAnsi="Calibri" w:cs="Calibri"/>
-        </w:rPr>
-        <w:t>backend</w:t>
-      </w:r>
-      <w:proofErr w:type="spellEnd"/>
-      <w:r>
-        <w:rPr>
-          <w:rFonts w:ascii="Calibri" w:eastAsia="Calibri" w:hAnsi="Calibri" w:cs="Calibri"/>
-        </w:rPr>
-        <w:t xml:space="preserve"> será desarrollado con Spring Boot, administrado con Maven.</w:t>
+        <w:t>El backend será desarrollado con Spring Boot, administrado con Maven.</w:t>
       </w:r>
     </w:p>
     <w:p>
@@ -3445,35 +3318,7 @@
         <w:rPr>
           <w:rFonts w:ascii="Calibri" w:eastAsia="Calibri" w:hAnsi="Calibri" w:cs="Calibri"/>
         </w:rPr>
-        <w:t xml:space="preserve">La comunicación entre </w:t>
-      </w:r>
-      <w:proofErr w:type="spellStart"/>
-      <w:r>
-        <w:rPr>
-          <w:rFonts w:ascii="Calibri" w:eastAsia="Calibri" w:hAnsi="Calibri" w:cs="Calibri"/>
-        </w:rPr>
-        <w:t>frontend</w:t>
-      </w:r>
-      <w:proofErr w:type="spellEnd"/>
-      <w:r>
-        <w:rPr>
-          <w:rFonts w:ascii="Calibri" w:eastAsia="Calibri" w:hAnsi="Calibri" w:cs="Calibri"/>
-        </w:rPr>
-        <w:t xml:space="preserve"> y </w:t>
-      </w:r>
-      <w:proofErr w:type="spellStart"/>
-      <w:r>
-        <w:rPr>
-          <w:rFonts w:ascii="Calibri" w:eastAsia="Calibri" w:hAnsi="Calibri" w:cs="Calibri"/>
-        </w:rPr>
-        <w:t>backend</w:t>
-      </w:r>
-      <w:proofErr w:type="spellEnd"/>
-      <w:r>
-        <w:rPr>
-          <w:rFonts w:ascii="Calibri" w:eastAsia="Calibri" w:hAnsi="Calibri" w:cs="Calibri"/>
-        </w:rPr>
-        <w:t xml:space="preserve"> se realizará mediante API REST.</w:t>
+        <w:t>La comunicación entre frontend y backend se realizará mediante API REST.</w:t>
       </w:r>
     </w:p>
     <w:p>
@@ -3531,21 +3376,7 @@
         <w:rPr>
           <w:rFonts w:ascii="Calibri" w:eastAsia="Calibri" w:hAnsi="Calibri" w:cs="Calibri"/>
         </w:rPr>
-        <w:t>El sistema “</w:t>
-      </w:r>
-      <w:proofErr w:type="spellStart"/>
-      <w:r>
-        <w:rPr>
-          <w:rFonts w:ascii="Calibri" w:eastAsia="Calibri" w:hAnsi="Calibri" w:cs="Calibri"/>
-        </w:rPr>
-        <w:t>Cosarbo</w:t>
-      </w:r>
-      <w:proofErr w:type="spellEnd"/>
-      <w:r>
-        <w:rPr>
-          <w:rFonts w:ascii="Calibri" w:eastAsia="Calibri" w:hAnsi="Calibri" w:cs="Calibri"/>
-        </w:rPr>
-        <w:t>” correrá en el sistema operativo Windows 10 y Windows 11 en primera instancia.</w:t>
+        <w:t>El sistema “Cosarbo” correrá en el sistema operativo Windows 10 y Windows 11 en primera instancia.</w:t>
       </w:r>
     </w:p>
     <w:p>
@@ -3829,21 +3660,7 @@
         <w:rPr>
           <w:rFonts w:ascii="Calibri" w:eastAsia="Calibri" w:hAnsi="Calibri" w:cs="Calibri"/>
         </w:rPr>
-        <w:t xml:space="preserve">UI-3: El </w:t>
-      </w:r>
-      <w:proofErr w:type="spellStart"/>
-      <w:r>
-        <w:rPr>
-          <w:rFonts w:ascii="Calibri" w:eastAsia="Calibri" w:hAnsi="Calibri" w:cs="Calibri"/>
-        </w:rPr>
-        <w:t>footer</w:t>
-      </w:r>
-      <w:proofErr w:type="spellEnd"/>
-      <w:r>
-        <w:rPr>
-          <w:rFonts w:ascii="Calibri" w:eastAsia="Calibri" w:hAnsi="Calibri" w:cs="Calibri"/>
-        </w:rPr>
-        <w:t xml:space="preserve"> debe estar en la parte inferior del sitio, independientemente del contenido.</w:t>
+        <w:t>UI-3: El footer debe estar en la parte inferior del sitio, independientemente del contenido.</w:t>
       </w:r>
     </w:p>
     <w:p>
@@ -3878,21 +3695,7 @@
         <w:rPr>
           <w:rFonts w:ascii="Calibri" w:eastAsia="Calibri" w:hAnsi="Calibri" w:cs="Calibri"/>
         </w:rPr>
-        <w:t xml:space="preserve">UI-5: En el </w:t>
-      </w:r>
-      <w:proofErr w:type="spellStart"/>
-      <w:r>
-        <w:rPr>
-          <w:rFonts w:ascii="Calibri" w:eastAsia="Calibri" w:hAnsi="Calibri" w:cs="Calibri"/>
-        </w:rPr>
-        <w:t>footer</w:t>
-      </w:r>
-      <w:proofErr w:type="spellEnd"/>
-      <w:r>
-        <w:rPr>
-          <w:rFonts w:ascii="Calibri" w:eastAsia="Calibri" w:hAnsi="Calibri" w:cs="Calibri"/>
-        </w:rPr>
-        <w:t xml:space="preserve"> debe estar la información de contacto, los derechos reservados y las redes sociales.</w:t>
+        <w:t>UI-5: En el footer debe estar la información de contacto, los derechos reservados y las redes sociales.</w:t>
       </w:r>
     </w:p>
     <w:p>
@@ -4048,8 +3851,6 @@
         </w:rPr>
         <w:t>SI-2: La visualización será realizada mediante “</w:t>
       </w:r>
-      <w:proofErr w:type="spellStart"/>
-      <w:proofErr w:type="gramStart"/>
       <w:r>
         <w:rPr>
           <w:rFonts w:ascii="Calibri" w:eastAsia="Calibri" w:hAnsi="Calibri" w:cs="Calibri"/>
@@ -4058,31 +3859,13 @@
           <w:sz w:val="20"/>
           <w:szCs w:val="20"/>
         </w:rPr>
-        <w:t>Netlify</w:t>
-      </w:r>
-      <w:proofErr w:type="spellEnd"/>
-      <w:r>
-        <w:rPr>
-          <w:rFonts w:ascii="Calibri" w:eastAsia="Calibri" w:hAnsi="Calibri" w:cs="Calibri"/>
-          <w:i/>
-          <w:iCs/>
-          <w:sz w:val="20"/>
-          <w:szCs w:val="20"/>
-        </w:rPr>
-        <w:t xml:space="preserve"> </w:t>
-      </w:r>
-      <w:r>
-        <w:rPr>
-          <w:rFonts w:ascii="Calibri" w:eastAsia="Calibri" w:hAnsi="Calibri" w:cs="Calibri"/>
-        </w:rPr>
-        <w:t>”</w:t>
-      </w:r>
-      <w:proofErr w:type="gramEnd"/>
-      <w:r>
-        <w:rPr>
-          <w:rFonts w:ascii="Calibri" w:eastAsia="Calibri" w:hAnsi="Calibri" w:cs="Calibri"/>
-        </w:rPr>
-        <w:t>.</w:t>
+        <w:t xml:space="preserve">Netlify </w:t>
+      </w:r>
+      <w:r>
+        <w:rPr>
+          <w:rFonts w:ascii="Calibri" w:eastAsia="Calibri" w:hAnsi="Calibri" w:cs="Calibri"/>
+        </w:rPr>
+        <w:t>”.</w:t>
       </w:r>
     </w:p>
     <w:p>
@@ -4223,51 +4006,7 @@
         <w:rPr>
           <w:rFonts w:ascii="Calibri" w:eastAsia="Calibri" w:hAnsi="Calibri" w:cs="Calibri"/>
         </w:rPr>
-        <w:t xml:space="preserve">Descripción: El sistema debe mostrar el catálogo de los servicios de </w:t>
-      </w:r>
-      <w:proofErr w:type="spellStart"/>
-      <w:r>
-        <w:rPr>
-          <w:rFonts w:ascii="Calibri" w:eastAsia="Calibri" w:hAnsi="Calibri" w:cs="Calibri"/>
-        </w:rPr>
-        <w:t>costurería</w:t>
-      </w:r>
-      <w:proofErr w:type="spellEnd"/>
-      <w:r>
-        <w:rPr>
-          <w:rFonts w:ascii="Calibri" w:eastAsia="Calibri" w:hAnsi="Calibri" w:cs="Calibri"/>
-        </w:rPr>
-        <w:t xml:space="preserve"> con despliegue de selección para definir el tipo de prenda para el </w:t>
-      </w:r>
-      <w:proofErr w:type="spellStart"/>
-      <w:proofErr w:type="gramStart"/>
-      <w:r>
-        <w:rPr>
-          <w:rFonts w:ascii="Calibri" w:eastAsia="Calibri" w:hAnsi="Calibri" w:cs="Calibri"/>
-        </w:rPr>
-        <w:t>servicio,además</w:t>
-      </w:r>
-      <w:proofErr w:type="spellEnd"/>
-      <w:proofErr w:type="gramEnd"/>
-      <w:r>
-        <w:rPr>
-          <w:rFonts w:ascii="Calibri" w:eastAsia="Calibri" w:hAnsi="Calibri" w:cs="Calibri"/>
-        </w:rPr>
-        <w:t xml:space="preserve"> de los artículos de Amigurumis, con </w:t>
-      </w:r>
-      <w:proofErr w:type="spellStart"/>
-      <w:r>
-        <w:rPr>
-          <w:rFonts w:ascii="Calibri" w:eastAsia="Calibri" w:hAnsi="Calibri" w:cs="Calibri"/>
-        </w:rPr>
-        <w:t>imágen</w:t>
-      </w:r>
-      <w:proofErr w:type="spellEnd"/>
-      <w:r>
-        <w:rPr>
-          <w:rFonts w:ascii="Calibri" w:eastAsia="Calibri" w:hAnsi="Calibri" w:cs="Calibri"/>
-        </w:rPr>
-        <w:t xml:space="preserve"> referencial y precio.</w:t>
+        <w:t>Descripción: El sistema debe mostrar el catálogo de los servicios de costurería con despliegue de selección para definir el tipo de prenda para el servicio,además de los artículos de Amigurumis, con imágen referencial y precio.</w:t>
       </w:r>
     </w:p>
     <w:p>
@@ -4493,69 +4232,6 @@
       <w:r>
         <w:rPr>
           <w:rFonts w:ascii="Calibri" w:eastAsia="Calibri" w:hAnsi="Calibri" w:cs="Calibri"/>
-          <w:color w:val="FF0000"/>
-        </w:rPr>
-        <w:tab/>
-      </w:r>
-      <w:r>
-        <w:rPr>
-          <w:rFonts w:ascii="Calibri" w:eastAsia="Calibri" w:hAnsi="Calibri" w:cs="Calibri"/>
-        </w:rPr>
-        <w:t>3.2.5</w:t>
-      </w:r>
-      <w:r>
-        <w:rPr>
-          <w:rFonts w:ascii="Calibri" w:eastAsia="Calibri" w:hAnsi="Calibri" w:cs="Calibri"/>
-        </w:rPr>
-        <w:tab/>
-        <w:t>RF-5: Página de contacto:</w:t>
-      </w:r>
-    </w:p>
-    <w:p>
-      <w:pPr>
-        <w:numPr>
-          <w:ilvl w:val="0"/>
-          <w:numId w:val="9"/>
-        </w:numPr>
-        <w:rPr>
-          <w:rFonts w:ascii="Calibri" w:eastAsia="Calibri" w:hAnsi="Calibri" w:cs="Calibri"/>
-        </w:rPr>
-      </w:pPr>
-      <w:r>
-        <w:rPr>
-          <w:rFonts w:ascii="Calibri" w:eastAsia="Calibri" w:hAnsi="Calibri" w:cs="Calibri"/>
-        </w:rPr>
-        <w:t>Descripción: El sistema debe tener una sección de contacto con formulario básico (nombre completo, correo electrónico y contenido)</w:t>
-      </w:r>
-    </w:p>
-    <w:p>
-      <w:pPr>
-        <w:numPr>
-          <w:ilvl w:val="0"/>
-          <w:numId w:val="9"/>
-        </w:numPr>
-        <w:spacing w:after="200"/>
-        <w:rPr>
-          <w:rFonts w:ascii="Calibri" w:eastAsia="Calibri" w:hAnsi="Calibri" w:cs="Calibri"/>
-        </w:rPr>
-      </w:pPr>
-      <w:r>
-        <w:rPr>
-          <w:rFonts w:ascii="Calibri" w:eastAsia="Calibri" w:hAnsi="Calibri" w:cs="Calibri"/>
-        </w:rPr>
-        <w:t>Actores: Cliente.</w:t>
-      </w:r>
-    </w:p>
-    <w:p>
-      <w:pPr>
-        <w:spacing w:after="200"/>
-        <w:rPr>
-          <w:rFonts w:ascii="Calibri" w:eastAsia="Calibri" w:hAnsi="Calibri" w:cs="Calibri"/>
-        </w:rPr>
-      </w:pPr>
-      <w:r>
-        <w:rPr>
-          <w:rFonts w:ascii="Calibri" w:eastAsia="Calibri" w:hAnsi="Calibri" w:cs="Calibri"/>
         </w:rPr>
         <w:tab/>
         <w:t>3.2.6</w:t>
@@ -4687,26 +4363,6 @@
     </w:p>
     <w:p>
       <w:pPr>
-        <w:numPr>
-          <w:ilvl w:val="0"/>
-          <w:numId w:val="1"/>
-        </w:numPr>
-        <w:spacing w:after="200"/>
-        <w:rPr>
-          <w:rFonts w:ascii="Calibri" w:eastAsia="Calibri" w:hAnsi="Calibri" w:cs="Calibri"/>
-          <w:color w:val="FF0000"/>
-        </w:rPr>
-      </w:pPr>
-      <w:r>
-        <w:rPr>
-          <w:rFonts w:ascii="Calibri" w:eastAsia="Calibri" w:hAnsi="Calibri" w:cs="Calibri"/>
-          <w:color w:val="FF0000"/>
-        </w:rPr>
-        <w:t>RNF-1: El catálogo debe cargar en menos de 3 segundos usando Live Server.</w:t>
-      </w:r>
-    </w:p>
-    <w:p>
-      <w:pPr>
         <w:pStyle w:val="Ttulo3"/>
         <w:keepLines w:val="0"/>
         <w:spacing w:before="240" w:after="60" w:line="240" w:lineRule="auto"/>
@@ -4901,7 +4557,6 @@
         </w:rPr>
         <w:t xml:space="preserve">RNF-5: El sitio web debe estar disponible el 100% del tiempo en </w:t>
       </w:r>
-      <w:proofErr w:type="spellStart"/>
       <w:r>
         <w:rPr>
           <w:rFonts w:ascii="Calibri" w:eastAsia="Calibri" w:hAnsi="Calibri" w:cs="Calibri"/>
@@ -4912,7 +4567,6 @@
         </w:rPr>
         <w:t>Netlify</w:t>
       </w:r>
-      <w:proofErr w:type="spellEnd"/>
       <w:r>
         <w:rPr>
           <w:rFonts w:ascii="Calibri" w:eastAsia="Calibri" w:hAnsi="Calibri" w:cs="Calibri"/>
@@ -4977,7 +4631,7 @@
         <w:rPr>
           <w:rFonts w:ascii="Calibri" w:eastAsia="Calibri" w:hAnsi="Calibri" w:cs="Calibri"/>
         </w:rPr>
-        <w:t>RNF-6: El código debe estar organizado en carpetas y comentado para facilitar futuras modificaciones.</w:t>
+        <w:t>RNF-6: El código debe estar organizado en carpetas para facilitar futuras modificaciones.</w:t>
       </w:r>
     </w:p>
     <w:p>

</xml_diff>